<commit_message>
Update CCH log Section 5 with Bruce Bonnett Case Conference guidance
Replaced generic "reviewed materials" with specific Oct 3 Case
Conference guidance from Bruce Bonnett (HMI Instructor):
- Wearables != primary metric, trust the process (applied: 3-4 day tracking)
- Buckshot approach: over-deliver, monitor which land (applied: Depth Dial primary)
- Reverse induction: tracker checking = deepening trigger (scheduled S2c)
- Fish at bottom: one powerful image (scheduled S2b Delta Floor)
- Miniature golf: onset/night-waking technique (scheduled S2c)
- One powerful anchor > 10 complex installations (applied: Depth Dial priority)
- 5-min bedtime Zoom offered
- Tracking reframed to subjective, every 3-4 days

Co-Authored-By: Claude Opus 4.6 (1M context) <noreply@anthropic.com>
</commit_message>
<xml_diff>
--- a/Clients/Deepak Shankar/Documents/CCH-Log-S2a-2026-10-08.docx
+++ b/Clients/Deepak Shankar/Documents/CCH-Log-S2a-2026-10-08.docx
@@ -473,7 +473,71 @@
     </w:p>
     <w:p>
       <w:r>
-        <w:t>Prior to this session, reviewed relevant HMI case conference materials. Plan to discuss this specific session with supervisor to review clinical decisions made during the session.</w:t>
+        <w:t>Yes. I discussed this client at the October 3 Case Conference with Bruce Bonnett (HMI Instructor). The following guidance was received and applied to this session and all subsequent sessions for this client:</w:t>
+      </w:r>
+    </w:p>
+    <w:p>
+      <w:pPr>
+        <w:pStyle w:val="ListBullet"/>
+      </w:pPr>
+      <w:r>
+        <w:t>Bruce Bonnett: Set expectations that wearables measure outcome but are NOT the primary metric. Tracking can hinder speed of improvement if client fixates on numbers. Trust the process, monitor how you FEEL, not what the app says. Applied: reframed tracking to every 3-4 days subjective rather than daily device checking.</w:t>
+      </w:r>
+    </w:p>
+    <w:p>
+      <w:pPr>
+        <w:pStyle w:val="ListBullet"/>
+      </w:pPr>
+      <w:r>
+        <w:t>Bruce Bonnett: Over-deliver sleep suggestions using the buckshot approach. Something will work. Monitor which techniques land for this specific client. Applied: installed Depth Dial as the primary anchor, with cellular regeneration as secondary. Will assess which resonated most before Session 2b.</w:t>
+      </w:r>
+    </w:p>
+    <w:p>
+      <w:pPr>
+        <w:pStyle w:val="ListBullet"/>
+      </w:pPr>
+      <w:r>
+        <w:t>Bruce Bonnett: If client obsesses over tracker stats, use REVERSE INDUCTION. Convert the checking-anxiety into a deepening trigger. Every glance at the tracker reinforces deeper sleep the next night. The more he thinks about deep sleep, the stronger the drift into delta. Applied: will be installed as "Tracker Convincer" in Session 2c.</w:t>
+      </w:r>
+    </w:p>
+    <w:p>
+      <w:pPr>
+        <w:pStyle w:val="ListBullet"/>
+      </w:pPr>
+      <w:r>
+        <w:t>Bruce Bonnett: Fish at the bottom of the ocean imagery. Safest, deepest part. Simple. Physical. Powerful. One image, one anchor. Applied: incorporated into Delta Floor installation (scheduled for Session 2b) — sinking to the bottom like a stone, cradled by pressure, not crushed.</w:t>
+      </w:r>
+    </w:p>
+    <w:p>
+      <w:pPr>
+        <w:pStyle w:val="ListBullet"/>
+      </w:pPr>
+      <w:r>
+        <w:t>Bruce Bonnett: Miniature golf technique for sleep onset and night-waking. Mundane enough to not excite, structured enough to displace worry, sequential enough to occupy the engineer brain. Applied: included in the Interrupted Sleep Protocol scheduled for Session 2c.</w:t>
+      </w:r>
+    </w:p>
+    <w:p>
+      <w:pPr>
+        <w:pStyle w:val="ListBullet"/>
+      </w:pPr>
+      <w:r>
+        <w:t>Instructor: One simple deep suggestion ("tonight you sink to the bottom, heaviest place") can double or triple deep sleep. Do not over-engineer with 10 complex installations when one powerful anchor may outperform. Applied: prioritized Depth Dial as the single most powerful anchor in S2a. Quality over quantity.</w:t>
+      </w:r>
+    </w:p>
+    <w:p>
+      <w:pPr>
+        <w:pStyle w:val="ListBullet"/>
+      </w:pPr>
+      <w:r>
+        <w:t>Instructor: Offer 5-minute bedtime Zoom call for first week post-installation. Guide settling and Depth Dial in real sleep environment. Resets pattern. Applied: offered to Deepak at end of session.</w:t>
+      </w:r>
+    </w:p>
+    <w:p>
+      <w:pPr>
+        <w:pStyle w:val="ListBullet"/>
+      </w:pPr>
+      <w:r>
+        <w:t>Instructor: Reframe tracking from daily to every 3-4 days. "How you feel matters more than what the app says." Applied: tracking guidance in AVS and homework set to every 3-4 days with subjective measures only.</w:t>
       </w:r>
     </w:p>
     <w:p>

</xml_diff>